<commit_message>
Ajout de la demo, et mise a jour du journal
</commit_message>
<xml_diff>
--- a/journal.docx
+++ b/journal.docx
@@ -15,12 +15,14 @@
         </w:rPr>
         <w:t xml:space="preserve">Journal </w:t>
       </w:r>
+      <w:proofErr w:type="spellStart"/>
       <w:r>
         <w:rPr>
           <w:lang w:val="en-US"/>
         </w:rPr>
         <w:t>Hebdomadaire</w:t>
       </w:r>
+      <w:proofErr w:type="spellEnd"/>
     </w:p>
     <w:p>
       <w:pPr>
@@ -29,11 +31,19 @@
           <w:lang w:val="en-US"/>
         </w:rPr>
       </w:pPr>
+      <w:proofErr w:type="spellStart"/>
       <w:r>
         <w:rPr>
           <w:lang w:val="en-US"/>
         </w:rPr>
-        <w:t>Semaine 1</w:t>
+        <w:t>Semaine</w:t>
+      </w:r>
+      <w:proofErr w:type="spellEnd"/>
+      <w:r>
+        <w:rPr>
+          <w:lang w:val="en-US"/>
+        </w:rPr>
+        <w:t xml:space="preserve"> 1</w:t>
       </w:r>
     </w:p>
     <w:tbl>
@@ -116,7 +126,43 @@
                 <w:bCs/>
                 <w:lang w:val="en-US"/>
               </w:rPr>
-              <w:t>À faire (semaine prochaine)</w:t>
+              <w:t>À faire (</w:t>
+            </w:r>
+            <w:proofErr w:type="spellStart"/>
+            <w:r>
+              <w:rPr>
+                <w:b/>
+                <w:bCs/>
+                <w:lang w:val="en-US"/>
+              </w:rPr>
+              <w:t>semaine</w:t>
+            </w:r>
+            <w:proofErr w:type="spellEnd"/>
+            <w:r>
+              <w:rPr>
+                <w:b/>
+                <w:bCs/>
+                <w:lang w:val="en-US"/>
+              </w:rPr>
+              <w:t xml:space="preserve"> </w:t>
+            </w:r>
+            <w:proofErr w:type="spellStart"/>
+            <w:r>
+              <w:rPr>
+                <w:b/>
+                <w:bCs/>
+                <w:lang w:val="en-US"/>
+              </w:rPr>
+              <w:t>prochaine</w:t>
+            </w:r>
+            <w:proofErr w:type="spellEnd"/>
+            <w:r>
+              <w:rPr>
+                <w:b/>
+                <w:bCs/>
+                <w:lang w:val="en-US"/>
+              </w:rPr>
+              <w:t>)</w:t>
             </w:r>
           </w:p>
         </w:tc>
@@ -200,16 +246,10 @@
               <w:t>Recherche</w:t>
             </w:r>
             <w:r>
-              <w:t xml:space="preserve"> </w:t>
-            </w:r>
-            <w:r>
-              <w:t>et documentation</w:t>
-            </w:r>
-            <w:r>
-              <w:t xml:space="preserve"> </w:t>
-            </w:r>
-            <w:r>
-              <w:t>des cas d’utilisation typiques</w:t>
+              <w:t xml:space="preserve"> et documentation</w:t>
+            </w:r>
+            <w:r>
+              <w:t xml:space="preserve"> des cas d’utilisation typiques</w:t>
             </w:r>
             <w:r>
               <w:t>, etc.</w:t>
@@ -350,7 +390,43 @@
                 <w:bCs/>
                 <w:lang w:val="en-US"/>
               </w:rPr>
-              <w:t>À faire (semaine prochaine)</w:t>
+              <w:t>À faire (</w:t>
+            </w:r>
+            <w:proofErr w:type="spellStart"/>
+            <w:r>
+              <w:rPr>
+                <w:b/>
+                <w:bCs/>
+                <w:lang w:val="en-US"/>
+              </w:rPr>
+              <w:t>semaine</w:t>
+            </w:r>
+            <w:proofErr w:type="spellEnd"/>
+            <w:r>
+              <w:rPr>
+                <w:b/>
+                <w:bCs/>
+                <w:lang w:val="en-US"/>
+              </w:rPr>
+              <w:t xml:space="preserve"> </w:t>
+            </w:r>
+            <w:proofErr w:type="spellStart"/>
+            <w:r>
+              <w:rPr>
+                <w:b/>
+                <w:bCs/>
+                <w:lang w:val="en-US"/>
+              </w:rPr>
+              <w:t>prochaine</w:t>
+            </w:r>
+            <w:proofErr w:type="spellEnd"/>
+            <w:r>
+              <w:rPr>
+                <w:b/>
+                <w:bCs/>
+                <w:lang w:val="en-US"/>
+              </w:rPr>
+              <w:t>)</w:t>
             </w:r>
           </w:p>
         </w:tc>
@@ -377,16 +453,23 @@
           </w:tcPr>
           <w:p>
             <w:r>
-              <w:t xml:space="preserve">Recherche </w:t>
-            </w:r>
-            <w:r>
-              <w:t xml:space="preserve">et documentation </w:t>
-            </w:r>
-            <w:r>
-              <w:t xml:space="preserve">des fonctionnalités, </w:t>
-            </w:r>
-            <w:r>
-              <w:t>création d’un env pour geminiCLI (et utilisation de celui-ci pour recherche</w:t>
+              <w:t xml:space="preserve">Recherche et documentation des fonctionnalités, création d’un </w:t>
+            </w:r>
+            <w:proofErr w:type="spellStart"/>
+            <w:r>
+              <w:t>env</w:t>
+            </w:r>
+            <w:proofErr w:type="spellEnd"/>
+            <w:r>
+              <w:t xml:space="preserve"> pour </w:t>
+            </w:r>
+            <w:proofErr w:type="spellStart"/>
+            <w:r>
+              <w:t>geminiCLI</w:t>
+            </w:r>
+            <w:proofErr w:type="spellEnd"/>
+            <w:r>
+              <w:t xml:space="preserve"> (et utilisation de celui-ci pour recherche</w:t>
             </w:r>
             <w:r>
               <w:t>s</w:t>
@@ -402,7 +485,7 @@
           </w:tcPr>
           <w:p>
             <w:r>
-              <w:t>À compléter LUNDI</w:t>
+              <w:t>Travail sur la démo</w:t>
             </w:r>
           </w:p>
         </w:tc>
@@ -424,23 +507,20 @@
           </w:tcPr>
           <w:p>
             <w:r>
-              <w:t>Recherche et documentation des cas d’utilisation typiques</w:t>
-            </w:r>
-            <w:r>
-              <w:t>, utilisation(documenté) de l’IA pour complémentation)</w:t>
-            </w:r>
-            <w:r>
-              <w:t>, etc.</w:t>
-            </w:r>
-          </w:p>
-        </w:tc>
-        <w:tc>
-          <w:tcPr>
-            <w:tcW w:w="2877" w:type="dxa"/>
-          </w:tcPr>
-          <w:p>
-            <w:r>
-              <w:t>À compléter LUNDI</w:t>
+              <w:t>Recherche et documentation des cas d’utilisation typiques, utilisation(documenté) de l’IA pour complémentation), etc.</w:t>
+            </w:r>
+          </w:p>
+        </w:tc>
+        <w:tc>
+          <w:tcPr>
+            <w:tcW w:w="2877" w:type="dxa"/>
+          </w:tcPr>
+          <w:p>
+            <w:r>
+              <w:t xml:space="preserve">Travail sur la </w:t>
+            </w:r>
+            <w:r>
+              <w:t>démo</w:t>
             </w:r>
           </w:p>
         </w:tc>
@@ -462,23 +542,17 @@
           </w:tcPr>
           <w:p>
             <w:r>
-              <w:t>Recherche et documentation des bonnes pratiques</w:t>
-            </w:r>
-            <w:r>
-              <w:t>, familiarisation (pratique) avec n8n</w:t>
-            </w:r>
-            <w:r>
-              <w:t>, etc.</w:t>
-            </w:r>
-          </w:p>
-        </w:tc>
-        <w:tc>
-          <w:tcPr>
-            <w:tcW w:w="2877" w:type="dxa"/>
-          </w:tcPr>
-          <w:p>
-            <w:r>
-              <w:t>À compléter LUNDI</w:t>
+              <w:t>Recherche et documentation des bonnes pratiques, familiarisation (pratique) avec n8n, etc.</w:t>
+            </w:r>
+          </w:p>
+        </w:tc>
+        <w:tc>
+          <w:tcPr>
+            <w:tcW w:w="2877" w:type="dxa"/>
+          </w:tcPr>
+          <w:p>
+            <w:r>
+              <w:t xml:space="preserve">Rapport synthèse </w:t>
             </w:r>
           </w:p>
         </w:tc>
@@ -497,8 +571,13 @@
     </w:p>
     <w:p>
       <w:r>
-        <w:t>Légende : `etc.` = Petites actions complémentaire, pas besoin de les mentioners</w:t>
+        <w:t xml:space="preserve">Légende : `etc.` = Petites actions complémentaire, pas besoin de les </w:t>
       </w:r>
+      <w:proofErr w:type="spellStart"/>
+      <w:r>
+        <w:t>mentioners</w:t>
+      </w:r>
+      <w:proofErr w:type="spellEnd"/>
     </w:p>
     <w:p>
       <w:pPr>
@@ -589,7 +668,43 @@
                 <w:bCs/>
                 <w:lang w:val="en-US"/>
               </w:rPr>
-              <w:t>À faire (semaine prochaine)</w:t>
+              <w:t>À faire (</w:t>
+            </w:r>
+            <w:proofErr w:type="spellStart"/>
+            <w:r>
+              <w:rPr>
+                <w:b/>
+                <w:bCs/>
+                <w:lang w:val="en-US"/>
+              </w:rPr>
+              <w:t>semaine</w:t>
+            </w:r>
+            <w:proofErr w:type="spellEnd"/>
+            <w:r>
+              <w:rPr>
+                <w:b/>
+                <w:bCs/>
+                <w:lang w:val="en-US"/>
+              </w:rPr>
+              <w:t xml:space="preserve"> </w:t>
+            </w:r>
+            <w:proofErr w:type="spellStart"/>
+            <w:r>
+              <w:rPr>
+                <w:b/>
+                <w:bCs/>
+                <w:lang w:val="en-US"/>
+              </w:rPr>
+              <w:t>prochaine</w:t>
+            </w:r>
+            <w:proofErr w:type="spellEnd"/>
+            <w:r>
+              <w:rPr>
+                <w:b/>
+                <w:bCs/>
+                <w:lang w:val="en-US"/>
+              </w:rPr>
+              <w:t>)</w:t>
             </w:r>
           </w:p>
         </w:tc>
@@ -614,13 +729,21 @@
           <w:tcPr>
             <w:tcW w:w="2877" w:type="dxa"/>
           </w:tcPr>
-          <w:p/>
-        </w:tc>
-        <w:tc>
-          <w:tcPr>
-            <w:tcW w:w="2877" w:type="dxa"/>
-          </w:tcPr>
-          <w:p/>
+          <w:p>
+            <w:r>
+              <w:t>Travail sur la démo</w:t>
+            </w:r>
+          </w:p>
+        </w:tc>
+        <w:tc>
+          <w:tcPr>
+            <w:tcW w:w="2877" w:type="dxa"/>
+          </w:tcPr>
+          <w:p>
+            <w:r>
+              <w:t>-</w:t>
+            </w:r>
+          </w:p>
         </w:tc>
       </w:tr>
       <w:tr>
@@ -638,13 +761,21 @@
           <w:tcPr>
             <w:tcW w:w="2877" w:type="dxa"/>
           </w:tcPr>
-          <w:p/>
-        </w:tc>
-        <w:tc>
-          <w:tcPr>
-            <w:tcW w:w="2877" w:type="dxa"/>
-          </w:tcPr>
-          <w:p/>
+          <w:p>
+            <w:r>
+              <w:t>Travail sur la démo</w:t>
+            </w:r>
+          </w:p>
+        </w:tc>
+        <w:tc>
+          <w:tcPr>
+            <w:tcW w:w="2877" w:type="dxa"/>
+          </w:tcPr>
+          <w:p>
+            <w:r>
+              <w:t>-</w:t>
+            </w:r>
+          </w:p>
         </w:tc>
       </w:tr>
       <w:tr>
@@ -662,7 +793,11 @@
           <w:tcPr>
             <w:tcW w:w="2877" w:type="dxa"/>
           </w:tcPr>
-          <w:p/>
+          <w:p>
+            <w:r>
+              <w:t xml:space="preserve">Rapport synthèse </w:t>
+            </w:r>
+          </w:p>
         </w:tc>
         <w:tc>
           <w:tcPr>
@@ -674,6 +809,12 @@
                 <w:lang w:val="en-US"/>
               </w:rPr>
             </w:pPr>
+            <w:r>
+              <w:rPr>
+                <w:lang w:val="en-US"/>
+              </w:rPr>
+              <w:t>-</w:t>
+            </w:r>
           </w:p>
         </w:tc>
       </w:tr>

</xml_diff>